<commit_message>
Time Log Ovcharenko 25.10.2026
</commit_message>
<xml_diff>
--- a/Reports, Logs & Evaluations/Time Logs/Ovcharenko/Time Log.docx
+++ b/Reports, Logs & Evaluations/Time Logs/Ovcharenko/Time Log.docx
@@ -4250,19 +4250,7 @@
               <w:rPr>
                 <w:sz w:val="22"/>
               </w:rPr>
-              <w:t>10/1</w:t>
-            </w:r>
-            <w:r>
-              <w:rPr>
-                <w:sz w:val="22"/>
-              </w:rPr>
-              <w:t>8</w:t>
-            </w:r>
-            <w:r>
-              <w:rPr>
-                <w:sz w:val="22"/>
-              </w:rPr>
-              <w:t>/26</w:t>
+              <w:t>10/18/26</w:t>
             </w:r>
           </w:p>
         </w:tc>
@@ -4564,13 +4552,516 @@
               <w:rPr>
                 <w:sz w:val="22"/>
               </w:rPr>
+              <w:t>Week total: 420 min</w:t>
+            </w:r>
+          </w:p>
+        </w:tc>
+      </w:tr>
+      <w:tr>
+        <w:trPr>
+          <w:trHeight w:val="844" w:hRule="atLeast"/>
+        </w:trPr>
+        <w:tc>
+          <w:tcPr>
+            <w:tcW w:w="1819" w:type="dxa"/>
+            <w:tcBorders>
+              <w:top w:val="nil"/>
+            </w:tcBorders>
+          </w:tcPr>
+          <w:p>
+            <w:pPr>
+              <w:pStyle w:val="Normal"/>
+              <w:widowControl/>
+              <w:suppressAutoHyphens w:val="true"/>
+              <w:spacing w:lineRule="auto" w:line="240" w:before="0" w:after="0"/>
+              <w:jc w:val="left"/>
+              <w:rPr>
+                <w:rFonts w:ascii="Calibri" w:hAnsi="Calibri" w:eastAsia="Calibri" w:cs=""/>
+                <w:kern w:val="0"/>
+                <w:sz w:val="22"/>
+                <w:szCs w:val="22"/>
+                <w:lang w:val="en-US" w:eastAsia="en-US" w:bidi="ar-SA"/>
+              </w:rPr>
+            </w:pPr>
+            <w:r>
+              <w:rPr>
+                <w:rFonts w:eastAsia="Calibri" w:cs=""/>
+                <w:kern w:val="0"/>
+                <w:sz w:val="22"/>
+                <w:szCs w:val="22"/>
+                <w:lang w:val="en-US" w:eastAsia="en-US" w:bidi="ar-SA"/>
+              </w:rPr>
+              <w:t>Week 6: 1</w:t>
+            </w:r>
+            <w:r>
+              <w:rPr>
+                <w:rFonts w:eastAsia="Calibri" w:cs=""/>
+                <w:kern w:val="0"/>
+                <w:sz w:val="22"/>
+                <w:szCs w:val="22"/>
+                <w:lang w:val="en-US" w:eastAsia="en-US" w:bidi="ar-SA"/>
+              </w:rPr>
+              <w:t>0</w:t>
+            </w:r>
+            <w:r>
+              <w:rPr>
+                <w:rFonts w:eastAsia="Calibri" w:cs=""/>
+                <w:kern w:val="0"/>
+                <w:sz w:val="22"/>
+                <w:szCs w:val="22"/>
+                <w:lang w:val="en-US" w:eastAsia="en-US" w:bidi="ar-SA"/>
+              </w:rPr>
+              <w:t>/1</w:t>
+            </w:r>
+            <w:r>
+              <w:rPr>
+                <w:rFonts w:eastAsia="Calibri" w:cs=""/>
+                <w:kern w:val="0"/>
+                <w:sz w:val="22"/>
+                <w:szCs w:val="22"/>
+                <w:lang w:val="en-US" w:eastAsia="en-US" w:bidi="ar-SA"/>
+              </w:rPr>
+              <w:t>9</w:t>
+            </w:r>
+            <w:r>
+              <w:rPr>
+                <w:rFonts w:eastAsia="Calibri" w:cs=""/>
+                <w:kern w:val="0"/>
+                <w:sz w:val="22"/>
+                <w:szCs w:val="22"/>
+                <w:lang w:val="en-US" w:eastAsia="en-US" w:bidi="ar-SA"/>
+              </w:rPr>
+              <w:t>/26-</w:t>
+            </w:r>
+            <w:r>
+              <w:rPr>
+                <w:rFonts w:eastAsia="Calibri" w:cs=""/>
+                <w:kern w:val="0"/>
+                <w:sz w:val="22"/>
+                <w:szCs w:val="22"/>
+                <w:lang w:val="en-US" w:eastAsia="en-US" w:bidi="ar-SA"/>
+              </w:rPr>
+              <w:t>10</w:t>
+            </w:r>
+            <w:r>
+              <w:rPr>
+                <w:rFonts w:eastAsia="Calibri" w:cs=""/>
+                <w:kern w:val="0"/>
+                <w:sz w:val="22"/>
+                <w:szCs w:val="22"/>
+                <w:lang w:val="en-US" w:eastAsia="en-US" w:bidi="ar-SA"/>
+              </w:rPr>
+              <w:t>/</w:t>
+            </w:r>
+            <w:r>
+              <w:rPr>
+                <w:rFonts w:eastAsia="Calibri" w:cs=""/>
+                <w:kern w:val="0"/>
+                <w:sz w:val="22"/>
+                <w:szCs w:val="22"/>
+                <w:lang w:val="en-US" w:eastAsia="en-US" w:bidi="ar-SA"/>
+              </w:rPr>
+              <w:t>25</w:t>
+            </w:r>
+            <w:r>
+              <w:rPr>
+                <w:rFonts w:eastAsia="Calibri" w:cs=""/>
+                <w:kern w:val="0"/>
+                <w:sz w:val="22"/>
+                <w:szCs w:val="22"/>
+                <w:lang w:val="en-US" w:eastAsia="en-US" w:bidi="ar-SA"/>
+              </w:rPr>
+              <w:t>/26</w:t>
+            </w:r>
+          </w:p>
+        </w:tc>
+        <w:tc>
+          <w:tcPr>
+            <w:tcW w:w="1772" w:type="dxa"/>
+            <w:tcBorders>
+              <w:top w:val="nil"/>
+            </w:tcBorders>
+          </w:tcPr>
+          <w:p>
+            <w:pPr>
+              <w:pStyle w:val="Normal"/>
+              <w:widowControl/>
+              <w:suppressAutoHyphens w:val="true"/>
+              <w:spacing w:lineRule="auto" w:line="240" w:before="0" w:after="0"/>
+              <w:jc w:val="left"/>
+              <w:rPr>
+                <w:rFonts w:ascii="Calibri" w:hAnsi="Calibri" w:eastAsia="Calibri" w:cs=""/>
+                <w:kern w:val="0"/>
+                <w:sz w:val="22"/>
+                <w:szCs w:val="22"/>
+                <w:lang w:val="en-US" w:eastAsia="en-US" w:bidi="ar-SA"/>
+              </w:rPr>
+            </w:pPr>
+            <w:r>
+              <w:rPr>
+                <w:rFonts w:eastAsia="Calibri" w:cs=""/>
+                <w:kern w:val="0"/>
+                <w:sz w:val="22"/>
+                <w:szCs w:val="22"/>
+                <w:lang w:val="en-US" w:eastAsia="en-US" w:bidi="ar-SA"/>
+              </w:rPr>
+              <w:t>Sketching Development Plan</w:t>
+            </w:r>
+          </w:p>
+        </w:tc>
+        <w:tc>
+          <w:tcPr>
+            <w:tcW w:w="1323" w:type="dxa"/>
+            <w:tcBorders>
+              <w:top w:val="nil"/>
+            </w:tcBorders>
+          </w:tcPr>
+          <w:p>
+            <w:pPr>
+              <w:pStyle w:val="Normal"/>
+              <w:widowControl/>
+              <w:suppressAutoHyphens w:val="true"/>
+              <w:spacing w:lineRule="auto" w:line="240" w:before="0" w:after="0"/>
+              <w:jc w:val="left"/>
+              <w:rPr>
+                <w:rFonts w:ascii="Calibri" w:hAnsi="Calibri" w:eastAsia="Calibri" w:cs=""/>
+                <w:kern w:val="0"/>
+                <w:sz w:val="22"/>
+                <w:szCs w:val="22"/>
+                <w:lang w:val="en-US" w:eastAsia="en-US" w:bidi="ar-SA"/>
+              </w:rPr>
+            </w:pPr>
+            <w:r>
+              <w:rPr>
+                <w:sz w:val="22"/>
+              </w:rPr>
+              <w:t>10/</w:t>
+            </w:r>
+            <w:r>
+              <w:rPr>
+                <w:sz w:val="22"/>
+              </w:rPr>
+              <w:t>24</w:t>
+            </w:r>
+            <w:r>
+              <w:rPr>
+                <w:sz w:val="22"/>
+              </w:rPr>
+              <w:t>/26</w:t>
+            </w:r>
+          </w:p>
+        </w:tc>
+        <w:tc>
+          <w:tcPr>
+            <w:tcW w:w="1516" w:type="dxa"/>
+            <w:tcBorders>
+              <w:top w:val="nil"/>
+            </w:tcBorders>
+          </w:tcPr>
+          <w:p>
+            <w:pPr>
+              <w:pStyle w:val="Normal"/>
+              <w:widowControl/>
+              <w:suppressAutoHyphens w:val="true"/>
+              <w:spacing w:lineRule="auto" w:line="240" w:before="0" w:after="0"/>
+              <w:jc w:val="left"/>
+              <w:rPr>
+                <w:rFonts w:ascii="Calibri" w:hAnsi="Calibri" w:eastAsia="Calibri" w:cs=""/>
+                <w:kern w:val="0"/>
+                <w:sz w:val="22"/>
+                <w:szCs w:val="22"/>
+                <w:lang w:val="en-US" w:eastAsia="en-US" w:bidi="ar-SA"/>
+              </w:rPr>
+            </w:pPr>
+            <w:r>
+              <w:rPr>
+                <w:rFonts w:eastAsia="Calibri" w:cs=""/>
+                <w:kern w:val="0"/>
+                <w:sz w:val="22"/>
+                <w:szCs w:val="22"/>
+                <w:lang w:val="en-US" w:eastAsia="en-US" w:bidi="ar-SA"/>
+              </w:rPr>
+              <w:t>3:30 pm</w:t>
+            </w:r>
+          </w:p>
+        </w:tc>
+        <w:tc>
+          <w:tcPr>
+            <w:tcW w:w="1632" w:type="dxa"/>
+            <w:tcBorders>
+              <w:top w:val="nil"/>
+            </w:tcBorders>
+          </w:tcPr>
+          <w:p>
+            <w:pPr>
+              <w:pStyle w:val="Normal"/>
+              <w:widowControl/>
+              <w:suppressAutoHyphens w:val="true"/>
+              <w:spacing w:lineRule="auto" w:line="240" w:before="0" w:after="0"/>
+              <w:jc w:val="left"/>
+              <w:rPr>
+                <w:rFonts w:ascii="Calibri" w:hAnsi="Calibri" w:eastAsia="Calibri" w:cs=""/>
+                <w:kern w:val="0"/>
+                <w:sz w:val="22"/>
+                <w:szCs w:val="22"/>
+                <w:lang w:val="en-US" w:eastAsia="en-US" w:bidi="ar-SA"/>
+              </w:rPr>
+            </w:pPr>
+            <w:r>
+              <w:rPr>
+                <w:rFonts w:eastAsia="Calibri" w:cs=""/>
+                <w:kern w:val="0"/>
+                <w:sz w:val="22"/>
+                <w:szCs w:val="22"/>
+                <w:lang w:val="en-US" w:eastAsia="en-US" w:bidi="ar-SA"/>
+              </w:rPr>
+              <w:t>5:00 pm</w:t>
+            </w:r>
+          </w:p>
+        </w:tc>
+        <w:tc>
+          <w:tcPr>
+            <w:tcW w:w="1514" w:type="dxa"/>
+            <w:tcBorders>
+              <w:top w:val="nil"/>
+            </w:tcBorders>
+          </w:tcPr>
+          <w:p>
+            <w:pPr>
+              <w:pStyle w:val="Normal"/>
+              <w:widowControl/>
+              <w:suppressAutoHyphens w:val="true"/>
+              <w:spacing w:lineRule="auto" w:line="240" w:before="0" w:after="0"/>
+              <w:jc w:val="left"/>
+              <w:rPr>
+                <w:rFonts w:ascii="Calibri" w:hAnsi="Calibri" w:eastAsia="Calibri" w:cs=""/>
+                <w:kern w:val="0"/>
+                <w:sz w:val="22"/>
+                <w:szCs w:val="22"/>
+                <w:lang w:val="en-US" w:eastAsia="en-US" w:bidi="ar-SA"/>
+              </w:rPr>
+            </w:pPr>
+            <w:r>
+              <w:rPr>
+                <w:rFonts w:eastAsia="Calibri" w:cs=""/>
+                <w:kern w:val="0"/>
+                <w:sz w:val="22"/>
+                <w:szCs w:val="22"/>
+                <w:lang w:val="en-US" w:eastAsia="en-US" w:bidi="ar-SA"/>
+              </w:rPr>
+              <w:t>90 min</w:t>
+            </w:r>
+          </w:p>
+        </w:tc>
+      </w:tr>
+      <w:tr>
+        <w:trPr>
+          <w:trHeight w:val="231" w:hRule="atLeast"/>
+        </w:trPr>
+        <w:tc>
+          <w:tcPr>
+            <w:tcW w:w="1819" w:type="dxa"/>
+            <w:tcBorders>
+              <w:top w:val="nil"/>
+            </w:tcBorders>
+          </w:tcPr>
+          <w:p>
+            <w:pPr>
+              <w:pStyle w:val="Normal"/>
+              <w:widowControl/>
+              <w:suppressAutoHyphens w:val="true"/>
+              <w:spacing w:lineRule="auto" w:line="240" w:before="0" w:after="0"/>
+              <w:jc w:val="left"/>
+              <w:rPr>
+                <w:rFonts w:ascii="Calibri" w:hAnsi="Calibri" w:eastAsia="Calibri" w:cs=""/>
+                <w:kern w:val="0"/>
+                <w:sz w:val="22"/>
+                <w:szCs w:val="22"/>
+                <w:lang w:val="en-US" w:eastAsia="en-US" w:bidi="ar-SA"/>
+              </w:rPr>
+            </w:pPr>
+            <w:r>
+              <w:rPr>
+                <w:rFonts w:eastAsia="Calibri" w:cs=""/>
+                <w:kern w:val="0"/>
+                <w:sz w:val="22"/>
+                <w:szCs w:val="22"/>
+                <w:lang w:val="en-US" w:eastAsia="en-US" w:bidi="ar-SA"/>
+              </w:rPr>
+            </w:r>
+          </w:p>
+        </w:tc>
+        <w:tc>
+          <w:tcPr>
+            <w:tcW w:w="1772" w:type="dxa"/>
+            <w:tcBorders>
+              <w:top w:val="nil"/>
+            </w:tcBorders>
+          </w:tcPr>
+          <w:p>
+            <w:pPr>
+              <w:pStyle w:val="Normal"/>
+              <w:widowControl/>
+              <w:suppressAutoHyphens w:val="true"/>
+              <w:spacing w:lineRule="auto" w:line="240" w:before="0" w:after="0"/>
+              <w:jc w:val="left"/>
+              <w:rPr>
+                <w:rFonts w:ascii="Calibri" w:hAnsi="Calibri" w:eastAsia="Calibri" w:cs=""/>
+                <w:kern w:val="0"/>
+                <w:sz w:val="22"/>
+                <w:szCs w:val="22"/>
+                <w:lang w:val="en-US" w:eastAsia="en-US" w:bidi="ar-SA"/>
+              </w:rPr>
+            </w:pPr>
+            <w:r>
+              <w:rPr>
+                <w:rFonts w:eastAsia="Calibri" w:cs=""/>
+                <w:kern w:val="0"/>
+                <w:sz w:val="22"/>
+                <w:szCs w:val="22"/>
+                <w:lang w:val="en-US" w:eastAsia="en-US" w:bidi="ar-SA"/>
+              </w:rPr>
+            </w:r>
+          </w:p>
+        </w:tc>
+        <w:tc>
+          <w:tcPr>
+            <w:tcW w:w="1323" w:type="dxa"/>
+            <w:tcBorders>
+              <w:top w:val="nil"/>
+            </w:tcBorders>
+          </w:tcPr>
+          <w:p>
+            <w:pPr>
+              <w:pStyle w:val="Normal"/>
+              <w:widowControl/>
+              <w:suppressAutoHyphens w:val="true"/>
+              <w:spacing w:lineRule="auto" w:line="240" w:before="0" w:after="0"/>
+              <w:jc w:val="left"/>
+              <w:rPr>
+                <w:rFonts w:ascii="Calibri" w:hAnsi="Calibri" w:eastAsia="Calibri" w:cs=""/>
+                <w:kern w:val="0"/>
+                <w:sz w:val="22"/>
+                <w:szCs w:val="22"/>
+                <w:lang w:val="en-US" w:eastAsia="en-US" w:bidi="ar-SA"/>
+              </w:rPr>
+            </w:pPr>
+            <w:r>
+              <w:rPr>
+                <w:rFonts w:eastAsia="Calibri" w:cs=""/>
+                <w:kern w:val="0"/>
+                <w:sz w:val="22"/>
+                <w:szCs w:val="22"/>
+                <w:lang w:val="en-US" w:eastAsia="en-US" w:bidi="ar-SA"/>
+              </w:rPr>
+            </w:r>
+          </w:p>
+        </w:tc>
+        <w:tc>
+          <w:tcPr>
+            <w:tcW w:w="1516" w:type="dxa"/>
+            <w:tcBorders>
+              <w:top w:val="nil"/>
+            </w:tcBorders>
+          </w:tcPr>
+          <w:p>
+            <w:pPr>
+              <w:pStyle w:val="Normal"/>
+              <w:widowControl/>
+              <w:suppressAutoHyphens w:val="true"/>
+              <w:spacing w:lineRule="auto" w:line="240" w:before="0" w:after="0"/>
+              <w:jc w:val="left"/>
+              <w:rPr>
+                <w:rFonts w:ascii="Calibri" w:hAnsi="Calibri" w:eastAsia="Calibri" w:cs=""/>
+                <w:kern w:val="0"/>
+                <w:sz w:val="22"/>
+                <w:szCs w:val="22"/>
+                <w:lang w:val="en-US" w:eastAsia="en-US" w:bidi="ar-SA"/>
+              </w:rPr>
+            </w:pPr>
+            <w:r>
+              <w:rPr>
+                <w:rFonts w:eastAsia="Calibri" w:cs=""/>
+                <w:kern w:val="0"/>
+                <w:sz w:val="22"/>
+                <w:szCs w:val="22"/>
+                <w:lang w:val="en-US" w:eastAsia="en-US" w:bidi="ar-SA"/>
+              </w:rPr>
+            </w:r>
+          </w:p>
+        </w:tc>
+        <w:tc>
+          <w:tcPr>
+            <w:tcW w:w="1632" w:type="dxa"/>
+            <w:tcBorders>
+              <w:top w:val="nil"/>
+            </w:tcBorders>
+          </w:tcPr>
+          <w:p>
+            <w:pPr>
+              <w:pStyle w:val="Normal"/>
+              <w:widowControl/>
+              <w:suppressAutoHyphens w:val="true"/>
+              <w:spacing w:lineRule="auto" w:line="240" w:before="0" w:after="0"/>
+              <w:jc w:val="left"/>
+              <w:rPr>
+                <w:rFonts w:ascii="Calibri" w:hAnsi="Calibri" w:eastAsia="Calibri" w:cs=""/>
+                <w:kern w:val="0"/>
+                <w:sz w:val="22"/>
+                <w:szCs w:val="22"/>
+                <w:lang w:val="en-US" w:eastAsia="en-US" w:bidi="ar-SA"/>
+              </w:rPr>
+            </w:pPr>
+            <w:r>
+              <w:rPr>
+                <w:rFonts w:eastAsia="Calibri" w:cs=""/>
+                <w:kern w:val="0"/>
+                <w:sz w:val="22"/>
+                <w:szCs w:val="22"/>
+                <w:lang w:val="en-US" w:eastAsia="en-US" w:bidi="ar-SA"/>
+              </w:rPr>
+            </w:r>
+          </w:p>
+        </w:tc>
+        <w:tc>
+          <w:tcPr>
+            <w:tcW w:w="1514" w:type="dxa"/>
+            <w:tcBorders>
+              <w:top w:val="nil"/>
+            </w:tcBorders>
+          </w:tcPr>
+          <w:p>
+            <w:pPr>
+              <w:pStyle w:val="Normal"/>
+              <w:widowControl/>
+              <w:suppressAutoHyphens w:val="true"/>
+              <w:spacing w:lineRule="auto" w:line="240" w:before="0" w:after="0"/>
+              <w:jc w:val="left"/>
+              <w:rPr>
+                <w:rFonts w:ascii="Calibri" w:hAnsi="Calibri" w:eastAsia="Calibri" w:cs=""/>
+                <w:kern w:val="0"/>
+                <w:sz w:val="22"/>
+                <w:szCs w:val="22"/>
+                <w:lang w:val="en-US" w:eastAsia="en-US" w:bidi="ar-SA"/>
+              </w:rPr>
+            </w:pPr>
+            <w:r>
+              <w:rPr>
+                <w:sz w:val="22"/>
+              </w:rPr>
               <w:t xml:space="preserve">Week total: </w:t>
             </w:r>
             <w:r>
               <w:rPr>
                 <w:sz w:val="22"/>
               </w:rPr>
-              <w:t>420 min</w:t>
+              <w:t>9</w:t>
+            </w:r>
+            <w:r>
+              <w:rPr>
+                <w:sz w:val="22"/>
+              </w:rPr>
+              <w:t>0 min</w:t>
             </w:r>
           </w:p>
         </w:tc>
@@ -5109,6 +5600,29 @@
       <w:rFonts w:cs="Arial"/>
     </w:rPr>
   </w:style>
+  <w:style w:type="paragraph" w:styleId="user2">
+    <w:name w:val="Вміст таблиці (user)"/>
+    <w:basedOn w:val="Normal"/>
+    <w:qFormat/>
+    <w:pPr>
+      <w:widowControl w:val="false"/>
+      <w:suppressLineNumbers/>
+    </w:pPr>
+    <w:rPr/>
+  </w:style>
+  <w:style w:type="paragraph" w:styleId="user3">
+    <w:name w:val="Заголовок таблиці (user)"/>
+    <w:basedOn w:val="user2"/>
+    <w:qFormat/>
+    <w:pPr>
+      <w:suppressLineNumbers/>
+      <w:jc w:val="center"/>
+    </w:pPr>
+    <w:rPr>
+      <w:b/>
+      <w:bCs/>
+    </w:rPr>
+  </w:style>
   <w:style w:type="paragraph" w:styleId="Style16">
     <w:name w:val="Вміст таблиці"/>
     <w:basedOn w:val="Normal"/>
@@ -5132,31 +5646,8 @@
       <w:bCs/>
     </w:rPr>
   </w:style>
-  <w:style w:type="paragraph" w:styleId="user2">
-    <w:name w:val="Вміст таблиці (user)"/>
-    <w:basedOn w:val="Normal"/>
-    <w:qFormat/>
-    <w:pPr>
-      <w:widowControl w:val="false"/>
-      <w:suppressLineNumbers/>
-    </w:pPr>
-    <w:rPr/>
-  </w:style>
-  <w:style w:type="paragraph" w:styleId="user3">
-    <w:name w:val="Заголовок таблиці (user)"/>
-    <w:basedOn w:val="user2"/>
-    <w:qFormat/>
-    <w:pPr>
-      <w:suppressLineNumbers/>
-      <w:jc w:val="center"/>
-    </w:pPr>
-    <w:rPr>
-      <w:b/>
-      <w:bCs/>
-    </w:rPr>
-  </w:style>
-  <w:style w:type="numbering" w:styleId="Style18" w:default="1">
-    <w:name w:val="Без маркерів"/>
+  <w:style w:type="numbering" w:styleId="user4" w:default="1">
+    <w:name w:val="Без маркерів (user)"/>
     <w:uiPriority w:val="99"/>
     <w:semiHidden/>
     <w:unhideWhenUsed/>

</xml_diff>